<commit_message>
docs(oms): add real login screenshot to user manual
</commit_message>
<xml_diff>
--- a/documentation/OMS_User_Manual.docx
+++ b/documentation/OMS_User_Manual.docx
@@ -436,6 +436,55 @@
         <w:t>No data or server unavailable: refresh once, then contact an administrator with the URL, time and action attempted.</w:t>
       </w:r>
     </w:p>
+    <w:p>
+      <w:pPr>
+        <w:pStyle w:val="Heading1"/>
+      </w:pPr>
+      <w:r>
+        <w:t>Appendix: Login screen</w:t>
+      </w:r>
+    </w:p>
+    <w:p>
+      <w:r>
+        <w:t>Figure 1. OMS login screen. Enter your username or email and password; do not share credentials.</w:t>
+      </w:r>
+    </w:p>
+    <w:p>
+      <w:r>
+        <w:drawing>
+          <wp:inline xmlns:a="http://schemas.openxmlformats.org/drawingml/2006/main" xmlns:pic="http://schemas.openxmlformats.org/drawingml/2006/picture">
+            <wp:extent cx="5897880" cy="4194048"/>
+            <wp:docPr id="1" name="Picture 1"/>
+            <wp:cNvGraphicFramePr>
+              <a:graphicFrameLocks noChangeAspect="1"/>
+            </wp:cNvGraphicFramePr>
+            <a:graphic>
+              <a:graphicData uri="http://schemas.openxmlformats.org/drawingml/2006/picture">
+                <pic:pic>
+                  <pic:nvPicPr>
+                    <pic:cNvPr id="0" name="oms-login.png"/>
+                    <pic:cNvPicPr/>
+                  </pic:nvPicPr>
+                  <pic:blipFill>
+                    <a:blip r:embed="rId9"/>
+                    <a:stretch>
+                      <a:fillRect/>
+                    </a:stretch>
+                  </pic:blipFill>
+                  <pic:spPr>
+                    <a:xfrm>
+                      <a:off x="0" y="0"/>
+                      <a:ext cx="5897880" cy="4194048"/>
+                    </a:xfrm>
+                    <a:prstGeom prst="rect"/>
+                  </pic:spPr>
+                </pic:pic>
+              </a:graphicData>
+            </a:graphic>
+          </wp:inline>
+        </w:drawing>
+      </w:r>
+    </w:p>
     <w:sectPr>
       <w:pgSz w:w="12240" w:h="15840"/>
       <w:pgMar w:top="1152" w:right="1224" w:bottom="1152" w:left="1224" w:header="720" w:footer="720" w:gutter="0"/>

</xml_diff>